<commit_message>
Reorder Mission Log: move Patient Vitals to Entry 02, restore reserved slot at Entry 11
</commit_message>
<xml_diff>
--- a/resume/Omkar_Kalekar_Resume.docx
+++ b/resume/Omkar_Kalekar_Resume.docx
@@ -31,15 +31,15 @@
         <w:jc w:val="center"/>
         <w:rPr>
           <w:rFonts w:ascii="Times New Roman" w:hAnsi="Times New Roman" w:cs="Times New Roman"/>
-          <w:sz w:val="18"/>
-          <w:szCs w:val="18"/>
-        </w:rPr>
-      </w:pPr>
-      <w:r>
-        <w:rPr>
-          <w:rFonts w:ascii="Times New Roman" w:hAnsi="Times New Roman" w:cs="Times New Roman"/>
-          <w:sz w:val="18"/>
-          <w:szCs w:val="18"/>
+          <w:sz w:val="20"/>
+          <w:szCs w:val="20"/>
+        </w:rPr>
+      </w:pPr>
+      <w:r>
+        <w:rPr>
+          <w:rFonts w:ascii="Times New Roman" w:hAnsi="Times New Roman" w:cs="Times New Roman"/>
+          <w:sz w:val="20"/>
+          <w:szCs w:val="20"/>
         </w:rPr>
         <w:t xml:space="preserve">Baltimore, MD (open to relocate) | </w:t>
       </w:r>
@@ -48,8 +48,8 @@
           <w:rPr>
             <w:rStyle w:val="Hyperlink"/>
             <w:rFonts w:ascii="Times New Roman" w:hAnsi="Times New Roman" w:cs="Times New Roman"/>
-            <w:sz w:val="18"/>
-            <w:szCs w:val="18"/>
+            <w:sz w:val="20"/>
+            <w:szCs w:val="20"/>
           </w:rPr>
           <w:t>omkarkalekar2323@gmail.com</w:t>
         </w:r>
@@ -57,8 +57,8 @@
       <w:r>
         <w:rPr>
           <w:rFonts w:ascii="Times New Roman" w:hAnsi="Times New Roman" w:cs="Times New Roman"/>
-          <w:sz w:val="18"/>
-          <w:szCs w:val="18"/>
+          <w:sz w:val="20"/>
+          <w:szCs w:val="20"/>
         </w:rPr>
         <w:t xml:space="preserve"> | +1 667 345 4446 |</w:t>
       </w:r>
@@ -70,16 +70,16 @@
         <w:jc w:val="center"/>
         <w:rPr>
           <w:rFonts w:ascii="Times New Roman" w:hAnsi="Times New Roman" w:cs="Times New Roman"/>
-          <w:sz w:val="18"/>
-          <w:szCs w:val="18"/>
+          <w:sz w:val="20"/>
+          <w:szCs w:val="20"/>
           <w:lang w:val="en-US"/>
         </w:rPr>
       </w:pPr>
       <w:r>
         <w:rPr>
           <w:rFonts w:ascii="Times New Roman" w:hAnsi="Times New Roman" w:cs="Times New Roman"/>
-          <w:sz w:val="18"/>
-          <w:szCs w:val="18"/>
+          <w:sz w:val="20"/>
+          <w:szCs w:val="20"/>
         </w:rPr>
         <w:t xml:space="preserve"> </w:t>
       </w:r>
@@ -88,8 +88,8 @@
           <w:rPr>
             <w:rStyle w:val="Hyperlink"/>
             <w:rFonts w:ascii="Times New Roman" w:hAnsi="Times New Roman" w:cs="Times New Roman"/>
-            <w:sz w:val="18"/>
-            <w:szCs w:val="18"/>
+            <w:sz w:val="20"/>
+            <w:szCs w:val="20"/>
           </w:rPr>
           <w:t>linkedin.com/in/omkar-</w:t>
         </w:r>
@@ -98,8 +98,8 @@
           <w:rPr>
             <w:rStyle w:val="Hyperlink"/>
             <w:rFonts w:ascii="Times New Roman" w:hAnsi="Times New Roman" w:cs="Times New Roman"/>
-            <w:sz w:val="18"/>
-            <w:szCs w:val="18"/>
+            <w:sz w:val="20"/>
+            <w:szCs w:val="20"/>
           </w:rPr>
           <w:t>kalekar</w:t>
         </w:r>
@@ -108,8 +108,8 @@
       <w:r>
         <w:rPr>
           <w:rFonts w:ascii="Times New Roman" w:hAnsi="Times New Roman" w:cs="Times New Roman"/>
-          <w:sz w:val="18"/>
-          <w:szCs w:val="18"/>
+          <w:sz w:val="20"/>
+          <w:szCs w:val="20"/>
         </w:rPr>
         <w:t xml:space="preserve"> | </w:t>
       </w:r>
@@ -118,8 +118,8 @@
           <w:rPr>
             <w:rStyle w:val="Hyperlink"/>
             <w:rFonts w:ascii="Times New Roman" w:hAnsi="Times New Roman" w:cs="Times New Roman"/>
-            <w:sz w:val="18"/>
-            <w:szCs w:val="18"/>
+            <w:sz w:val="20"/>
+            <w:szCs w:val="20"/>
           </w:rPr>
           <w:t>omkark23.github.io/portfolio-website</w:t>
         </w:r>
@@ -1850,17 +1850,29 @@
         <w:ind w:left="-284"/>
         <w:rPr>
           <w:rFonts w:ascii="Times New Roman" w:hAnsi="Times New Roman" w:cs="Times New Roman"/>
-          <w:sz w:val="18"/>
-          <w:szCs w:val="18"/>
-        </w:rPr>
-      </w:pPr>
-      <w:r>
-        <w:rPr>
-          <w:rFonts w:ascii="Times New Roman" w:hAnsi="Times New Roman" w:cs="Times New Roman"/>
-          <w:sz w:val="18"/>
-          <w:szCs w:val="18"/>
-        </w:rPr>
-        <w:t xml:space="preserve">President, IETE College Chapter </w:t>
+          <w:b/>
+          <w:bCs/>
+          <w:sz w:val="18"/>
+          <w:szCs w:val="18"/>
+        </w:rPr>
+      </w:pPr>
+      <w:r>
+        <w:rPr>
+          <w:rFonts w:ascii="Times New Roman" w:hAnsi="Times New Roman" w:cs="Times New Roman"/>
+          <w:b/>
+          <w:bCs/>
+          <w:sz w:val="18"/>
+          <w:szCs w:val="18"/>
+        </w:rPr>
+        <w:t>President, IETE College Chapter</w:t>
+      </w:r>
+      <w:r>
+        <w:rPr>
+          <w:rFonts w:ascii="Times New Roman" w:hAnsi="Times New Roman" w:cs="Times New Roman"/>
+          <w:sz w:val="18"/>
+          <w:szCs w:val="18"/>
+        </w:rPr>
+        <w:t xml:space="preserve"> </w:t>
       </w:r>
       <w:r>
         <w:rPr>
@@ -1929,33 +1941,55 @@
       <w:r>
         <w:rPr>
           <w:rFonts w:ascii="Times New Roman" w:hAnsi="Times New Roman" w:cs="Times New Roman"/>
-          <w:sz w:val="18"/>
-          <w:szCs w:val="18"/>
-        </w:rPr>
-        <w:tab/>
-      </w:r>
-      <w:r>
-        <w:rPr>
-          <w:rFonts w:ascii="Times New Roman" w:hAnsi="Times New Roman" w:cs="Times New Roman"/>
-          <w:sz w:val="18"/>
-          <w:szCs w:val="18"/>
-        </w:rPr>
-        <w:t xml:space="preserve">Pune, India (2022 – 2023) </w:t>
+          <w:b/>
+          <w:bCs/>
+          <w:sz w:val="18"/>
+          <w:szCs w:val="18"/>
+        </w:rPr>
+        <w:t>Pune, India (2022 – 2023)</w:t>
       </w:r>
     </w:p>
     <w:p>
       <w:pPr>
+        <w:pStyle w:val="ListParagraph"/>
+        <w:numPr>
+          <w:ilvl w:val="0"/>
+          <w:numId w:val="13"/>
+        </w:numPr>
+        <w:spacing w:after="0"/>
+        <w:ind w:left="0" w:hanging="284"/>
+        <w:rPr>
+          <w:rFonts w:ascii="Times New Roman" w:hAnsi="Times New Roman" w:cs="Times New Roman"/>
+          <w:sz w:val="18"/>
+          <w:szCs w:val="18"/>
+        </w:rPr>
+      </w:pPr>
+      <w:r>
+        <w:rPr>
+          <w:rFonts w:ascii="Times New Roman" w:hAnsi="Times New Roman" w:cs="Times New Roman"/>
+          <w:sz w:val="18"/>
+          <w:szCs w:val="18"/>
+        </w:rPr>
+        <w:t>Organized seminars and events to help students build knowledge and skills in the field.</w:t>
+      </w:r>
+    </w:p>
+    <w:p>
+      <w:pPr>
         <w:spacing w:after="0"/>
         <w:ind w:left="-284"/>
         <w:rPr>
           <w:rFonts w:ascii="Times New Roman" w:hAnsi="Times New Roman" w:cs="Times New Roman"/>
-          <w:sz w:val="18"/>
-          <w:szCs w:val="18"/>
-        </w:rPr>
-      </w:pPr>
-      <w:r>
-        <w:rPr>
-          <w:rFonts w:ascii="Times New Roman" w:hAnsi="Times New Roman" w:cs="Times New Roman"/>
+          <w:b/>
+          <w:bCs/>
+          <w:sz w:val="18"/>
+          <w:szCs w:val="18"/>
+        </w:rPr>
+      </w:pPr>
+      <w:r>
+        <w:rPr>
+          <w:rFonts w:ascii="Times New Roman" w:hAnsi="Times New Roman" w:cs="Times New Roman"/>
+          <w:b/>
+          <w:bCs/>
           <w:sz w:val="18"/>
           <w:szCs w:val="18"/>
         </w:rPr>
@@ -1964,6 +1998,8 @@
       <w:r>
         <w:rPr>
           <w:rFonts w:ascii="Times New Roman" w:hAnsi="Times New Roman" w:cs="Times New Roman"/>
+          <w:b/>
+          <w:bCs/>
           <w:sz w:val="18"/>
           <w:szCs w:val="18"/>
         </w:rPr>
@@ -1972,6 +2008,8 @@
       <w:r>
         <w:rPr>
           <w:rFonts w:ascii="Times New Roman" w:hAnsi="Times New Roman" w:cs="Times New Roman"/>
+          <w:b/>
+          <w:bCs/>
           <w:sz w:val="18"/>
           <w:szCs w:val="18"/>
         </w:rPr>
@@ -1980,6 +2018,8 @@
       <w:r>
         <w:rPr>
           <w:rFonts w:ascii="Times New Roman" w:hAnsi="Times New Roman" w:cs="Times New Roman"/>
+          <w:b/>
+          <w:bCs/>
           <w:sz w:val="18"/>
           <w:szCs w:val="18"/>
         </w:rPr>
@@ -1988,6 +2028,8 @@
       <w:r>
         <w:rPr>
           <w:rFonts w:ascii="Times New Roman" w:hAnsi="Times New Roman" w:cs="Times New Roman"/>
+          <w:b/>
+          <w:bCs/>
           <w:sz w:val="18"/>
           <w:szCs w:val="18"/>
         </w:rPr>
@@ -1996,18 +2038,37 @@
       <w:r>
         <w:rPr>
           <w:rFonts w:ascii="Times New Roman" w:hAnsi="Times New Roman" w:cs="Times New Roman"/>
+          <w:b/>
+          <w:bCs/>
           <w:sz w:val="18"/>
           <w:szCs w:val="18"/>
         </w:rPr>
         <w:tab/>
-      </w:r>
-      <w:r>
-        <w:rPr>
-          <w:rFonts w:ascii="Times New Roman" w:hAnsi="Times New Roman" w:cs="Times New Roman"/>
-          <w:sz w:val="18"/>
-          <w:szCs w:val="18"/>
-        </w:rPr>
         <w:t>Pune, India (2021 – 2023)</w:t>
+      </w:r>
+    </w:p>
+    <w:p>
+      <w:pPr>
+        <w:pStyle w:val="ListParagraph"/>
+        <w:numPr>
+          <w:ilvl w:val="0"/>
+          <w:numId w:val="13"/>
+        </w:numPr>
+        <w:spacing w:after="0"/>
+        <w:ind w:left="0" w:hanging="284"/>
+        <w:rPr>
+          <w:rFonts w:ascii="Times New Roman" w:hAnsi="Times New Roman" w:cs="Times New Roman"/>
+          <w:sz w:val="18"/>
+          <w:szCs w:val="18"/>
+        </w:rPr>
+      </w:pPr>
+      <w:r>
+        <w:rPr>
+          <w:rFonts w:ascii="Times New Roman" w:hAnsi="Times New Roman" w:cs="Times New Roman"/>
+          <w:sz w:val="18"/>
+          <w:szCs w:val="18"/>
+        </w:rPr>
+        <w:t>Led technical workshops, managed content development, and coordinated communications across student and faculty groups.</w:t>
       </w:r>
     </w:p>
     <w:sectPr>
@@ -2018,7 +2079,7 @@
       <w:headerReference w:type="first" r:id="rId15"/>
       <w:footerReference w:type="first" r:id="rId16"/>
       <w:pgSz w:w="11906" w:h="16838"/>
-      <w:pgMar w:top="454" w:right="720" w:bottom="284" w:left="720" w:header="708" w:footer="708" w:gutter="0"/>
+      <w:pgMar w:top="454" w:right="720" w:bottom="284" w:left="720" w:header="140" w:footer="708" w:gutter="0"/>
       <w:cols w:space="708"/>
       <w:docGrid w:linePitch="360"/>
     </w:sectPr>
@@ -2121,6 +2182,10 @@
   <w:p>
     <w:pPr>
       <w:pStyle w:val="Header"/>
+      <w:spacing w:line="20" w:lineRule="auto"/>
+      <w:rPr>
+        <w:sz w:val="2"/>
+      </w:rPr>
     </w:pPr>
   </w:p>
 </w:hdr>
@@ -2139,6 +2204,118 @@
 <file path=word/numbering.xml><?xml version="1.0" encoding="utf-8"?>
 <w:numbering xmlns:wpc="http://schemas.microsoft.com/office/word/2010/wordprocessingCanvas" xmlns:cx="http://schemas.microsoft.com/office/drawing/2014/chartex" xmlns:cx1="http://schemas.microsoft.com/office/drawing/2015/9/8/chartex" xmlns:cx2="http://schemas.microsoft.com/office/drawing/2015/10/21/chartex" xmlns:cx3="http://schemas.microsoft.com/office/drawing/2016/5/9/chartex" xmlns:cx4="http://schemas.microsoft.com/office/drawing/2016/5/10/chartex" xmlns:cx5="http://schemas.microsoft.com/office/drawing/2016/5/11/chartex" xmlns:cx6="http://schemas.microsoft.com/office/drawing/2016/5/12/chartex" xmlns:cx7="http://schemas.microsoft.com/office/drawing/2016/5/13/chartex" xmlns:cx8="http://schemas.microsoft.com/office/drawing/2016/5/14/chartex" xmlns:mc="http://schemas.openxmlformats.org/markup-compatibility/2006" xmlns:m="http://schemas.openxmlformats.org/officeDocument/2006/math" xmlns:aink="http://schemas.microsoft.com/office/drawing/2016/ink" xmlns:am3d="http://schemas.microsoft.com/office/drawing/2017/model3d" xmlns:oel="http://schemas.microsoft.com/office/2019/extlst" xmlns:r="http://schemas.openxmlformats.org/officeDocument/2006/relationships" xmlns:wp14="http://schemas.microsoft.com/office/word/2010/wordprocessingDrawing" xmlns:wp="http://schemas.openxmlformats.org/drawingml/2006/wordprocessingDrawing" xmlns:wpg="http://schemas.microsoft.com/office/word/2010/wordprocessingGroup" xmlns:wpi="http://schemas.microsoft.com/office/word/2010/wordprocessingInk" xmlns:wps="http://schemas.microsoft.com/office/word/2010/wordprocessingShape" xmlns:o="urn:schemas-microsoft-com:office:office" xmlns:v="urn:schemas-microsoft-com:vml" xmlns:w10="urn:schemas-microsoft-com:office:word" xmlns:w="http://schemas.openxmlformats.org/wordprocessingml/2006/main" xmlns:w14="http://schemas.microsoft.com/office/word/2010/wordml" xmlns:w15="http://schemas.microsoft.com/office/word/2012/wordml" xmlns:w16cei="http://schemas.microsoft.com/office/word/2026/wordml/cei" xmlns:w16cex="http://schemas.microsoft.com/office/word/2018/wordml/cex" xmlns:w16cid="http://schemas.microsoft.com/office/word/2016/wordml/cid" xmlns:w16="http://schemas.microsoft.com/office/word/2018/wordml" xmlns:w16sdtdh="http://schemas.microsoft.com/office/word/2020/wordml/sdtdatahash" xmlns:w16sdtfl="http://schemas.microsoft.com/office/word/2024/wordml/sdtformatlock" xmlns:w16se="http://schemas.microsoft.com/office/word/2015/wordml/symex" xmlns:w16du="http://schemas.microsoft.com/office/word/2023/wordml/word16du" xmlns:wne="http://schemas.microsoft.com/office/word/2006/wordml" mc:Ignorable="w14 w15 w16se w16cid w16 w16cex w16sdtdh w16sdtfl w16du wp14">
   <w:abstractNum w:abstractNumId="0" w15:restartNumberingAfterBreak="0">
+    <w:nsid w:val="055B15FC"/>
+    <w:multiLevelType w:val="hybridMultilevel"/>
+    <w:tmpl w:val="D0C0F9AA"/>
+    <w:lvl w:ilvl="0" w:tplc="04090001">
+      <w:start w:val="1"/>
+      <w:numFmt w:val="bullet"/>
+      <w:lvlText w:val=""/>
+      <w:lvlJc w:val="left"/>
+      <w:pPr>
+        <w:ind w:left="436" w:hanging="360"/>
+      </w:pPr>
+      <w:rPr>
+        <w:rFonts w:ascii="Symbol" w:hAnsi="Symbol" w:hint="default"/>
+      </w:rPr>
+    </w:lvl>
+    <w:lvl w:ilvl="1" w:tplc="9728810A">
+      <w:numFmt w:val="bullet"/>
+      <w:lvlText w:val="•"/>
+      <w:lvlJc w:val="left"/>
+      <w:pPr>
+        <w:ind w:left="1156" w:hanging="360"/>
+      </w:pPr>
+      <w:rPr>
+        <w:rFonts w:ascii="Times New Roman" w:eastAsiaTheme="minorHAnsi" w:hAnsi="Times New Roman" w:cs="Times New Roman" w:hint="default"/>
+      </w:rPr>
+    </w:lvl>
+    <w:lvl w:ilvl="2" w:tplc="08090005" w:tentative="1">
+      <w:start w:val="1"/>
+      <w:numFmt w:val="bullet"/>
+      <w:lvlText w:val=""/>
+      <w:lvlJc w:val="left"/>
+      <w:pPr>
+        <w:ind w:left="1876" w:hanging="360"/>
+      </w:pPr>
+      <w:rPr>
+        <w:rFonts w:ascii="Wingdings" w:hAnsi="Wingdings" w:hint="default"/>
+      </w:rPr>
+    </w:lvl>
+    <w:lvl w:ilvl="3" w:tplc="08090001" w:tentative="1">
+      <w:start w:val="1"/>
+      <w:numFmt w:val="bullet"/>
+      <w:lvlText w:val=""/>
+      <w:lvlJc w:val="left"/>
+      <w:pPr>
+        <w:ind w:left="2596" w:hanging="360"/>
+      </w:pPr>
+      <w:rPr>
+        <w:rFonts w:ascii="Symbol" w:hAnsi="Symbol" w:hint="default"/>
+      </w:rPr>
+    </w:lvl>
+    <w:lvl w:ilvl="4" w:tplc="08090003" w:tentative="1">
+      <w:start w:val="1"/>
+      <w:numFmt w:val="bullet"/>
+      <w:lvlText w:val="o"/>
+      <w:lvlJc w:val="left"/>
+      <w:pPr>
+        <w:ind w:left="3316" w:hanging="360"/>
+      </w:pPr>
+      <w:rPr>
+        <w:rFonts w:ascii="Courier New" w:hAnsi="Courier New" w:cs="Courier New" w:hint="default"/>
+      </w:rPr>
+    </w:lvl>
+    <w:lvl w:ilvl="5" w:tplc="08090005" w:tentative="1">
+      <w:start w:val="1"/>
+      <w:numFmt w:val="bullet"/>
+      <w:lvlText w:val=""/>
+      <w:lvlJc w:val="left"/>
+      <w:pPr>
+        <w:ind w:left="4036" w:hanging="360"/>
+      </w:pPr>
+      <w:rPr>
+        <w:rFonts w:ascii="Wingdings" w:hAnsi="Wingdings" w:hint="default"/>
+      </w:rPr>
+    </w:lvl>
+    <w:lvl w:ilvl="6" w:tplc="08090001" w:tentative="1">
+      <w:start w:val="1"/>
+      <w:numFmt w:val="bullet"/>
+      <w:lvlText w:val=""/>
+      <w:lvlJc w:val="left"/>
+      <w:pPr>
+        <w:ind w:left="4756" w:hanging="360"/>
+      </w:pPr>
+      <w:rPr>
+        <w:rFonts w:ascii="Symbol" w:hAnsi="Symbol" w:hint="default"/>
+      </w:rPr>
+    </w:lvl>
+    <w:lvl w:ilvl="7" w:tplc="08090003" w:tentative="1">
+      <w:start w:val="1"/>
+      <w:numFmt w:val="bullet"/>
+      <w:lvlText w:val="o"/>
+      <w:lvlJc w:val="left"/>
+      <w:pPr>
+        <w:ind w:left="5476" w:hanging="360"/>
+      </w:pPr>
+      <w:rPr>
+        <w:rFonts w:ascii="Courier New" w:hAnsi="Courier New" w:cs="Courier New" w:hint="default"/>
+      </w:rPr>
+    </w:lvl>
+    <w:lvl w:ilvl="8" w:tplc="08090005" w:tentative="1">
+      <w:start w:val="1"/>
+      <w:numFmt w:val="bullet"/>
+      <w:lvlText w:val=""/>
+      <w:lvlJc w:val="left"/>
+      <w:pPr>
+        <w:ind w:left="6196" w:hanging="360"/>
+      </w:pPr>
+      <w:rPr>
+        <w:rFonts w:ascii="Wingdings" w:hAnsi="Wingdings" w:hint="default"/>
+      </w:rPr>
+    </w:lvl>
+  </w:abstractNum>
+  <w:abstractNum w:abstractNumId="1" w15:restartNumberingAfterBreak="0">
     <w:nsid w:val="177A6A88"/>
     <w:multiLevelType w:val="multilevel"/>
     <w:tmpl w:val="4958390C"/>
@@ -2287,7 +2464,7 @@
       </w:rPr>
     </w:lvl>
   </w:abstractNum>
-  <w:abstractNum w:abstractNumId="1" w15:restartNumberingAfterBreak="0">
+  <w:abstractNum w:abstractNumId="2" w15:restartNumberingAfterBreak="0">
     <w:nsid w:val="34D22D0A"/>
     <w:multiLevelType w:val="hybridMultilevel"/>
     <w:tmpl w:val="123A98C2"/>
@@ -2400,7 +2577,7 @@
       </w:rPr>
     </w:lvl>
   </w:abstractNum>
-  <w:abstractNum w:abstractNumId="2" w15:restartNumberingAfterBreak="0">
+  <w:abstractNum w:abstractNumId="3" w15:restartNumberingAfterBreak="0">
     <w:nsid w:val="3C4607C7"/>
     <w:multiLevelType w:val="multilevel"/>
     <w:tmpl w:val="20C816A8"/>
@@ -2549,7 +2726,7 @@
       </w:rPr>
     </w:lvl>
   </w:abstractNum>
-  <w:abstractNum w:abstractNumId="3" w15:restartNumberingAfterBreak="0">
+  <w:abstractNum w:abstractNumId="4" w15:restartNumberingAfterBreak="0">
     <w:nsid w:val="3FE44E75"/>
     <w:multiLevelType w:val="multilevel"/>
     <w:tmpl w:val="5A3C1364"/>
@@ -2698,7 +2875,7 @@
       </w:rPr>
     </w:lvl>
   </w:abstractNum>
-  <w:abstractNum w:abstractNumId="4" w15:restartNumberingAfterBreak="0">
+  <w:abstractNum w:abstractNumId="5" w15:restartNumberingAfterBreak="0">
     <w:nsid w:val="42D23DC7"/>
     <w:multiLevelType w:val="multilevel"/>
     <w:tmpl w:val="6FF223EC"/>
@@ -2847,7 +3024,7 @@
       </w:rPr>
     </w:lvl>
   </w:abstractNum>
-  <w:abstractNum w:abstractNumId="5" w15:restartNumberingAfterBreak="0">
+  <w:abstractNum w:abstractNumId="6" w15:restartNumberingAfterBreak="0">
     <w:nsid w:val="45AB75EC"/>
     <w:multiLevelType w:val="multilevel"/>
     <w:tmpl w:val="86DC3AE2"/>
@@ -2996,7 +3173,7 @@
       </w:rPr>
     </w:lvl>
   </w:abstractNum>
-  <w:abstractNum w:abstractNumId="6" w15:restartNumberingAfterBreak="0">
+  <w:abstractNum w:abstractNumId="7" w15:restartNumberingAfterBreak="0">
     <w:nsid w:val="57E4063D"/>
     <w:multiLevelType w:val="multilevel"/>
     <w:tmpl w:val="FF3C6F98"/>
@@ -3145,7 +3322,7 @@
       </w:rPr>
     </w:lvl>
   </w:abstractNum>
-  <w:abstractNum w:abstractNumId="7" w15:restartNumberingAfterBreak="0">
+  <w:abstractNum w:abstractNumId="8" w15:restartNumberingAfterBreak="0">
     <w:nsid w:val="68846B5F"/>
     <w:multiLevelType w:val="hybridMultilevel"/>
     <w:tmpl w:val="EB42E846"/>
@@ -3258,7 +3435,7 @@
       </w:rPr>
     </w:lvl>
   </w:abstractNum>
-  <w:abstractNum w:abstractNumId="8" w15:restartNumberingAfterBreak="0">
+  <w:abstractNum w:abstractNumId="9" w15:restartNumberingAfterBreak="0">
     <w:nsid w:val="68BD5A07"/>
     <w:multiLevelType w:val="multilevel"/>
     <w:tmpl w:val="0636AEDC"/>
@@ -3407,7 +3584,7 @@
       </w:rPr>
     </w:lvl>
   </w:abstractNum>
-  <w:abstractNum w:abstractNumId="9" w15:restartNumberingAfterBreak="0">
+  <w:abstractNum w:abstractNumId="10" w15:restartNumberingAfterBreak="0">
     <w:nsid w:val="740A74C9"/>
     <w:multiLevelType w:val="hybridMultilevel"/>
     <w:tmpl w:val="7C3C6C0C"/>
@@ -3520,7 +3697,7 @@
       </w:rPr>
     </w:lvl>
   </w:abstractNum>
-  <w:abstractNum w:abstractNumId="10" w15:restartNumberingAfterBreak="0">
+  <w:abstractNum w:abstractNumId="11" w15:restartNumberingAfterBreak="0">
     <w:nsid w:val="79784F4F"/>
     <w:multiLevelType w:val="multilevel"/>
     <w:tmpl w:val="B0AC2448"/>
@@ -3669,7 +3846,7 @@
       </w:rPr>
     </w:lvl>
   </w:abstractNum>
-  <w:abstractNum w:abstractNumId="11" w15:restartNumberingAfterBreak="0">
+  <w:abstractNum w:abstractNumId="12" w15:restartNumberingAfterBreak="0">
     <w:nsid w:val="7A880CB3"/>
     <w:multiLevelType w:val="hybridMultilevel"/>
     <w:tmpl w:val="AAB69252"/>
@@ -3783,40 +3960,43 @@
     </w:lvl>
   </w:abstractNum>
   <w:num w:numId="1" w16cid:durableId="1389645799">
+    <w:abstractNumId w:val="3"/>
+  </w:num>
+  <w:num w:numId="2" w16cid:durableId="1906723387">
+    <w:abstractNumId w:val="1"/>
+  </w:num>
+  <w:num w:numId="3" w16cid:durableId="887957317">
+    <w:abstractNumId w:val="11"/>
+  </w:num>
+  <w:num w:numId="4" w16cid:durableId="1312559745">
+    <w:abstractNumId w:val="5"/>
+  </w:num>
+  <w:num w:numId="5" w16cid:durableId="880628433">
+    <w:abstractNumId w:val="8"/>
+  </w:num>
+  <w:num w:numId="6" w16cid:durableId="58677169">
+    <w:abstractNumId w:val="12"/>
+  </w:num>
+  <w:num w:numId="7" w16cid:durableId="73748144">
+    <w:abstractNumId w:val="10"/>
+  </w:num>
+  <w:num w:numId="8" w16cid:durableId="203056435">
     <w:abstractNumId w:val="2"/>
   </w:num>
-  <w:num w:numId="2" w16cid:durableId="1906723387">
-    <w:abstractNumId w:val="0"/>
+  <w:num w:numId="9" w16cid:durableId="828524100">
+    <w:abstractNumId w:val="6"/>
   </w:num>
-  <w:num w:numId="3" w16cid:durableId="887957317">
-    <w:abstractNumId w:val="10"/>
+  <w:num w:numId="10" w16cid:durableId="1762600616">
+    <w:abstractNumId w:val="9"/>
   </w:num>
-  <w:num w:numId="4" w16cid:durableId="1312559745">
+  <w:num w:numId="11" w16cid:durableId="825510638">
     <w:abstractNumId w:val="4"/>
   </w:num>
-  <w:num w:numId="5" w16cid:durableId="880628433">
+  <w:num w:numId="12" w16cid:durableId="1341666872">
     <w:abstractNumId w:val="7"/>
   </w:num>
-  <w:num w:numId="6" w16cid:durableId="58677169">
-    <w:abstractNumId w:val="11"/>
-  </w:num>
-  <w:num w:numId="7" w16cid:durableId="73748144">
-    <w:abstractNumId w:val="9"/>
-  </w:num>
-  <w:num w:numId="8" w16cid:durableId="203056435">
-    <w:abstractNumId w:val="1"/>
-  </w:num>
-  <w:num w:numId="9" w16cid:durableId="828524100">
-    <w:abstractNumId w:val="5"/>
-  </w:num>
-  <w:num w:numId="10" w16cid:durableId="1762600616">
-    <w:abstractNumId w:val="8"/>
-  </w:num>
-  <w:num w:numId="11" w16cid:durableId="825510638">
-    <w:abstractNumId w:val="3"/>
-  </w:num>
-  <w:num w:numId="12" w16cid:durableId="1341666872">
-    <w:abstractNumId w:val="6"/>
+  <w:num w:numId="13" w16cid:durableId="1910186272">
+    <w:abstractNumId w:val="0"/>
   </w:num>
 </w:numbering>
 </file>
@@ -4422,6 +4602,7 @@
   <w:style w:type="character" w:default="1" w:styleId="DefaultParagraphFont">
     <w:name w:val="Default Paragraph Font"/>
     <w:uiPriority w:val="1"/>
+    <w:semiHidden/>
     <w:unhideWhenUsed/>
   </w:style>
   <w:style w:type="table" w:default="1" w:styleId="TableNormal">

</xml_diff>